<commit_message>
Add 4 reports: HERO-68955/67727/69921/69773 (Sprint20261019-20261030) + rebuild index
</commit_message>
<xml_diff>
--- a/Sprint20261019-20261030/HERO-69160_20261028_083257.docx
+++ b/Sprint20261019-20261030/HERO-69160_20261028_083257.docx
@@ -2,6 +2,68 @@
 <file path=word/document.xml><?xml version="1.0" encoding="utf-8"?>
 <w:document xmlns:wpc="http://schemas.microsoft.com/office/word/2010/wordprocessingCanvas" xmlns:mo="http://schemas.microsoft.com/office/mac/office/2008/main" xmlns:mc="http://schemas.openxmlformats.org/markup-compatibility/2006" xmlns:mv="urn:schemas-microsoft-com:mac:vml" xmlns:o="urn:schemas-microsoft-com:office:office" xmlns:r="http://schemas.openxmlformats.org/officeDocument/2006/relationships" xmlns:m="http://schemas.openxmlformats.org/officeDocument/2006/math" xmlns:v="urn:schemas-microsoft-com:vml" xmlns:wp14="http://schemas.microsoft.com/office/word/2010/wordprocessingDrawing" xmlns:wp="http://schemas.openxmlformats.org/drawingml/2006/wordprocessingDrawing" xmlns:w10="urn:schemas-microsoft-com:office:word" xmlns:w="http://schemas.openxmlformats.org/wordprocessingml/2006/main" xmlns:w14="http://schemas.microsoft.com/office/word/2010/wordml" xmlns:wpg="http://schemas.microsoft.com/office/word/2010/wordprocessingGroup" xmlns:wpi="http://schemas.microsoft.com/office/word/2010/wordprocessingInk" xmlns:wne="http://schemas.microsoft.com/office/word/2006/wordml" xmlns:wps="http://schemas.microsoft.com/office/word/2010/wordprocessingShape" mc:Ignorable="w14 wp14">
   <w:body>
+    <w:p>
+      <w:r>
+        <w:rPr>
+          <w:noProof/>
+        </w:rPr>
+        <w:drawing>
+          <wp:inline xmlns:wp="http://schemas.openxmlformats.org/drawingml/2006/wordprocessingDrawing" distT="0" distB="0" distL="0" distR="0">
+            <wp:extent cx="2400000" cy="380000"/>
+            <wp:docPr id="1" name="AILabel"/>
+            <a:graphic xmlns:a="http://schemas.openxmlformats.org/drawingml/2006/main">
+              <a:graphicData uri="http://schemas.microsoft.com/office/word/2010/wordprocessingShape">
+                <wps:wsp xmlns:wps="http://schemas.microsoft.com/office/word/2010/wordprocessingShape">
+                  <wps:cNvSpPr txBox="1"/>
+                  <wps:spPr>
+                    <a:xfrm>
+                      <a:off x="0" y="0"/>
+                      <a:ext cx="2400000" cy="380000"/>
+                    </a:xfrm>
+                    <a:prstGeom prst="rect">
+                      <a:avLst/>
+                    </a:prstGeom>
+                    <a:solidFill>
+                      <a:srgbClr val="000000">
+                        <a:alpha val="50000"/>
+                      </a:srgbClr>
+                    </a:solidFill>
+                    <a:ln w="12700">
+                      <a:solidFill>
+                        <a:srgbClr val="FFFFFF"/>
+                      </a:solidFill>
+                    </a:ln>
+                  </wps:spPr>
+                  <wps:txbx>
+                    <w:txbxContent xmlns:w="http://schemas.openxmlformats.org/wordprocessingml/2006/main">
+                      <w:p>
+                        <w:pPr>
+                          <w:jc w:val="center"/>
+                        </w:pPr>
+                        <w:r>
+                          <w:rPr>
+                            <w:b/>
+                            <w:sz w:val="28"/>
+                            <w:szCs w:val="28"/>
+                            <w:rFonts w:eastAsia="SimSun" w:ascii="Arial" w:hAnsi="Arial"/>
+                            <w:color w:val="FFFFFF"/>
+                          </w:rPr>
+                          <w:t>含 AI 生成</w:t>
+                        </w:r>
+                      </w:p>
+                    </w:txbxContent>
+                  </wps:txbx>
+                  <wps:bodyPr anchor="ctr" anchorCtr="0" lIns="91440" tIns="45720" rIns="91440" bIns="45720">
+                    <a:noAutofit/>
+                  </wps:bodyPr>
+                </wps:wsp>
+              </a:graphicData>
+            </a:graphic>
+          </wp:inline>
+        </w:drawing>
+      </w:r>
+    </w:p>
+    <w:p/>
     <w:p>
       <w:pPr>
         <w:spacing w:before="120" w:after="200"/>

</xml_diff>